<commit_message>
Fix repo URL in report, remove unused LaTeX draft, link report in README
</commit_message>
<xml_diff>
--- a/report/report.docx
+++ b/report/report.docx
@@ -57,7 +57,7 @@
           <w:rPr>
             <w:rStyle w:val="Hyperlink"/>
           </w:rPr>
-          <w:t>https://github.com/USERNAME/llm-fingerprint</w:t>
+          <w:t>https://github.com/WyattA-25/llm-fingerprint</w:t>
         </w:r>
       </w:hyperlink>
     </w:p>
@@ -252,12 +252,6 @@
         <w:gridCol w:w="1100"/>
       </w:tblGrid>
       <w:tr>
-        <w:tblPrEx>
-          <w:tblCellMar>
-            <w:top w:w="0" w:type="dxa"/>
-            <w:bottom w:w="0" w:type="dxa"/>
-          </w:tblCellMar>
-        </w:tblPrEx>
         <w:trPr>
           <w:tblHeader/>
         </w:trPr>
@@ -417,12 +411,6 @@
         </w:tc>
       </w:tr>
       <w:tr>
-        <w:tblPrEx>
-          <w:tblCellMar>
-            <w:top w:w="0" w:type="dxa"/>
-            <w:bottom w:w="0" w:type="dxa"/>
-          </w:tblCellMar>
-        </w:tblPrEx>
         <w:tc>
           <w:tcPr>
             <w:tcW w:w="1100" w:type="dxa"/>
@@ -564,12 +552,6 @@
         </w:tc>
       </w:tr>
       <w:tr>
-        <w:tblPrEx>
-          <w:tblCellMar>
-            <w:top w:w="0" w:type="dxa"/>
-            <w:bottom w:w="0" w:type="dxa"/>
-          </w:tblCellMar>
-        </w:tblPrEx>
         <w:tc>
           <w:tcPr>
             <w:tcW w:w="1100" w:type="dxa"/>
@@ -711,12 +693,6 @@
         </w:tc>
       </w:tr>
       <w:tr>
-        <w:tblPrEx>
-          <w:tblCellMar>
-            <w:top w:w="0" w:type="dxa"/>
-            <w:bottom w:w="0" w:type="dxa"/>
-          </w:tblCellMar>
-        </w:tblPrEx>
         <w:tc>
           <w:tcPr>
             <w:tcW w:w="1100" w:type="dxa"/>
@@ -858,12 +834,6 @@
         </w:tc>
       </w:tr>
       <w:tr>
-        <w:tblPrEx>
-          <w:tblCellMar>
-            <w:top w:w="0" w:type="dxa"/>
-            <w:bottom w:w="0" w:type="dxa"/>
-          </w:tblCellMar>
-        </w:tblPrEx>
         <w:tc>
           <w:tcPr>
             <w:tcW w:w="1100" w:type="dxa"/>
@@ -1006,12 +976,6 @@
         </w:tc>
       </w:tr>
       <w:tr>
-        <w:tblPrEx>
-          <w:tblCellMar>
-            <w:top w:w="0" w:type="dxa"/>
-            <w:bottom w:w="0" w:type="dxa"/>
-          </w:tblCellMar>
-        </w:tblPrEx>
         <w:tc>
           <w:tcPr>
             <w:tcW w:w="1100" w:type="dxa"/>
@@ -1153,12 +1117,6 @@
         </w:tc>
       </w:tr>
       <w:tr>
-        <w:tblPrEx>
-          <w:tblCellMar>
-            <w:top w:w="0" w:type="dxa"/>
-            <w:bottom w:w="0" w:type="dxa"/>
-          </w:tblCellMar>
-        </w:tblPrEx>
         <w:tc>
           <w:tcPr>
             <w:tcW w:w="1100" w:type="dxa"/>
@@ -1300,12 +1258,6 @@
         </w:tc>
       </w:tr>
       <w:tr>
-        <w:tblPrEx>
-          <w:tblCellMar>
-            <w:top w:w="0" w:type="dxa"/>
-            <w:bottom w:w="0" w:type="dxa"/>
-          </w:tblCellMar>
-        </w:tblPrEx>
         <w:tc>
           <w:tcPr>
             <w:tcW w:w="1100" w:type="dxa"/>
@@ -1447,12 +1399,6 @@
         </w:tc>
       </w:tr>
       <w:tr>
-        <w:tblPrEx>
-          <w:tblCellMar>
-            <w:top w:w="0" w:type="dxa"/>
-            <w:bottom w:w="0" w:type="dxa"/>
-          </w:tblCellMar>
-        </w:tblPrEx>
         <w:tc>
           <w:tcPr>
             <w:tcW w:w="1100" w:type="dxa"/>
@@ -1761,12 +1707,6 @@
         <w:gridCol w:w="1900"/>
       </w:tblGrid>
       <w:tr>
-        <w:tblPrEx>
-          <w:tblCellMar>
-            <w:top w:w="0" w:type="dxa"/>
-            <w:bottom w:w="0" w:type="dxa"/>
-          </w:tblCellMar>
-        </w:tblPrEx>
         <w:trPr>
           <w:tblHeader/>
         </w:trPr>
@@ -1929,12 +1869,6 @@
         </w:tc>
       </w:tr>
       <w:tr>
-        <w:tblPrEx>
-          <w:tblCellMar>
-            <w:top w:w="0" w:type="dxa"/>
-            <w:bottom w:w="0" w:type="dxa"/>
-          </w:tblCellMar>
-        </w:tblPrEx>
         <w:tc>
           <w:tcPr>
             <w:tcW w:w="1760" w:type="dxa"/>
@@ -2079,12 +2013,6 @@
         </w:tc>
       </w:tr>
       <w:tr>
-        <w:tblPrEx>
-          <w:tblCellMar>
-            <w:top w:w="0" w:type="dxa"/>
-            <w:bottom w:w="0" w:type="dxa"/>
-          </w:tblCellMar>
-        </w:tblPrEx>
         <w:tc>
           <w:tcPr>
             <w:tcW w:w="1760" w:type="dxa"/>
@@ -2229,12 +2157,6 @@
         </w:tc>
       </w:tr>
       <w:tr>
-        <w:tblPrEx>
-          <w:tblCellMar>
-            <w:top w:w="0" w:type="dxa"/>
-            <w:bottom w:w="0" w:type="dxa"/>
-          </w:tblCellMar>
-        </w:tblPrEx>
         <w:tc>
           <w:tcPr>
             <w:tcW w:w="1760" w:type="dxa"/>
@@ -2379,12 +2301,6 @@
         </w:tc>
       </w:tr>
       <w:tr>
-        <w:tblPrEx>
-          <w:tblCellMar>
-            <w:top w:w="0" w:type="dxa"/>
-            <w:bottom w:w="0" w:type="dxa"/>
-          </w:tblCellMar>
-        </w:tblPrEx>
         <w:tc>
           <w:tcPr>
             <w:tcW w:w="1760" w:type="dxa"/>
@@ -2529,12 +2445,6 @@
         </w:tc>
       </w:tr>
       <w:tr>
-        <w:tblPrEx>
-          <w:tblCellMar>
-            <w:top w:w="0" w:type="dxa"/>
-            <w:bottom w:w="0" w:type="dxa"/>
-          </w:tblCellMar>
-        </w:tblPrEx>
         <w:tc>
           <w:tcPr>
             <w:tcW w:w="1760" w:type="dxa"/>
@@ -2679,12 +2589,6 @@
         </w:tc>
       </w:tr>
       <w:tr>
-        <w:tblPrEx>
-          <w:tblCellMar>
-            <w:top w:w="0" w:type="dxa"/>
-            <w:bottom w:w="0" w:type="dxa"/>
-          </w:tblCellMar>
-        </w:tblPrEx>
         <w:tc>
           <w:tcPr>
             <w:tcW w:w="1760" w:type="dxa"/>
@@ -2829,12 +2733,6 @@
         </w:tc>
       </w:tr>
       <w:tr>
-        <w:tblPrEx>
-          <w:tblCellMar>
-            <w:top w:w="0" w:type="dxa"/>
-            <w:bottom w:w="0" w:type="dxa"/>
-          </w:tblCellMar>
-        </w:tblPrEx>
         <w:tc>
           <w:tcPr>
             <w:tcW w:w="1760" w:type="dxa"/>
@@ -2979,12 +2877,6 @@
         </w:tc>
       </w:tr>
       <w:tr>
-        <w:tblPrEx>
-          <w:tblCellMar>
-            <w:top w:w="0" w:type="dxa"/>
-            <w:bottom w:w="0" w:type="dxa"/>
-          </w:tblCellMar>
-        </w:tblPrEx>
         <w:tc>
           <w:tcPr>
             <w:tcW w:w="1760" w:type="dxa"/>
@@ -3269,12 +3161,6 @@
         <w:gridCol w:w="6760"/>
       </w:tblGrid>
       <w:tr>
-        <w:tblPrEx>
-          <w:tblCellMar>
-            <w:top w:w="0" w:type="dxa"/>
-            <w:bottom w:w="0" w:type="dxa"/>
-          </w:tblCellMar>
-        </w:tblPrEx>
         <w:trPr>
           <w:tblHeader/>
         </w:trPr>
@@ -3349,12 +3235,6 @@
         </w:tc>
       </w:tr>
       <w:tr>
-        <w:tblPrEx>
-          <w:tblCellMar>
-            <w:top w:w="0" w:type="dxa"/>
-            <w:bottom w:w="0" w:type="dxa"/>
-          </w:tblCellMar>
-        </w:tblPrEx>
         <w:tc>
           <w:tcPr>
             <w:tcW w:w="2600" w:type="dxa"/>
@@ -3434,12 +3314,6 @@
         </w:tc>
       </w:tr>
       <w:tr>
-        <w:tblPrEx>
-          <w:tblCellMar>
-            <w:top w:w="0" w:type="dxa"/>
-            <w:bottom w:w="0" w:type="dxa"/>
-          </w:tblCellMar>
-        </w:tblPrEx>
         <w:tc>
           <w:tcPr>
             <w:tcW w:w="2600" w:type="dxa"/>
@@ -3494,12 +3368,6 @@
         </w:tc>
       </w:tr>
       <w:tr>
-        <w:tblPrEx>
-          <w:tblCellMar>
-            <w:top w:w="0" w:type="dxa"/>
-            <w:bottom w:w="0" w:type="dxa"/>
-          </w:tblCellMar>
-        </w:tblPrEx>
         <w:tc>
           <w:tcPr>
             <w:tcW w:w="2600" w:type="dxa"/>
@@ -3570,12 +3438,6 @@
         </w:tc>
       </w:tr>
       <w:tr>
-        <w:tblPrEx>
-          <w:tblCellMar>
-            <w:top w:w="0" w:type="dxa"/>
-            <w:bottom w:w="0" w:type="dxa"/>
-          </w:tblCellMar>
-        </w:tblPrEx>
         <w:tc>
           <w:tcPr>
             <w:tcW w:w="2600" w:type="dxa"/>
@@ -3630,12 +3492,6 @@
         </w:tc>
       </w:tr>
       <w:tr>
-        <w:tblPrEx>
-          <w:tblCellMar>
-            <w:top w:w="0" w:type="dxa"/>
-            <w:bottom w:w="0" w:type="dxa"/>
-          </w:tblCellMar>
-        </w:tblPrEx>
         <w:tc>
           <w:tcPr>
             <w:tcW w:w="2600" w:type="dxa"/>
@@ -3805,12 +3661,6 @@
         <w:gridCol w:w="2500"/>
       </w:tblGrid>
       <w:tr>
-        <w:tblPrEx>
-          <w:tblCellMar>
-            <w:top w:w="0" w:type="dxa"/>
-            <w:bottom w:w="0" w:type="dxa"/>
-          </w:tblCellMar>
-        </w:tblPrEx>
         <w:trPr>
           <w:tblHeader/>
         </w:trPr>
@@ -3909,12 +3759,6 @@
         </w:tc>
       </w:tr>
       <w:tr>
-        <w:tblPrEx>
-          <w:tblCellMar>
-            <w:top w:w="0" w:type="dxa"/>
-            <w:bottom w:w="0" w:type="dxa"/>
-          </w:tblCellMar>
-        </w:tblPrEx>
         <w:tc>
           <w:tcPr>
             <w:tcW w:w="4360" w:type="dxa"/>
@@ -4001,12 +3845,6 @@
         </w:tc>
       </w:tr>
       <w:tr>
-        <w:tblPrEx>
-          <w:tblCellMar>
-            <w:top w:w="0" w:type="dxa"/>
-            <w:bottom w:w="0" w:type="dxa"/>
-          </w:tblCellMar>
-        </w:tblPrEx>
         <w:tc>
           <w:tcPr>
             <w:tcW w:w="4360" w:type="dxa"/>
@@ -4093,12 +3931,6 @@
         </w:tc>
       </w:tr>
       <w:tr>
-        <w:tblPrEx>
-          <w:tblCellMar>
-            <w:top w:w="0" w:type="dxa"/>
-            <w:bottom w:w="0" w:type="dxa"/>
-          </w:tblCellMar>
-        </w:tblPrEx>
         <w:tc>
           <w:tcPr>
             <w:tcW w:w="4360" w:type="dxa"/>
@@ -4185,12 +4017,6 @@
         </w:tc>
       </w:tr>
       <w:tr>
-        <w:tblPrEx>
-          <w:tblCellMar>
-            <w:top w:w="0" w:type="dxa"/>
-            <w:bottom w:w="0" w:type="dxa"/>
-          </w:tblCellMar>
-        </w:tblPrEx>
         <w:tc>
           <w:tcPr>
             <w:tcW w:w="4360" w:type="dxa"/>
@@ -4286,12 +4112,6 @@
         </w:tc>
       </w:tr>
       <w:tr>
-        <w:tblPrEx>
-          <w:tblCellMar>
-            <w:top w:w="0" w:type="dxa"/>
-            <w:bottom w:w="0" w:type="dxa"/>
-          </w:tblCellMar>
-        </w:tblPrEx>
         <w:tc>
           <w:tcPr>
             <w:tcW w:w="4360" w:type="dxa"/>
@@ -4563,12 +4383,6 @@
         <w:gridCol w:w="2400"/>
       </w:tblGrid>
       <w:tr>
-        <w:tblPrEx>
-          <w:tblCellMar>
-            <w:top w:w="0" w:type="dxa"/>
-            <w:bottom w:w="0" w:type="dxa"/>
-          </w:tblCellMar>
-        </w:tblPrEx>
         <w:trPr>
           <w:tblHeader/>
         </w:trPr>
@@ -4731,12 +4545,6 @@
         </w:tc>
       </w:tr>
       <w:tr>
-        <w:tblPrEx>
-          <w:tblCellMar>
-            <w:top w:w="0" w:type="dxa"/>
-            <w:bottom w:w="0" w:type="dxa"/>
-          </w:tblCellMar>
-        </w:tblPrEx>
         <w:tc>
           <w:tcPr>
             <w:tcW w:w="1560" w:type="dxa"/>
@@ -4881,12 +4689,6 @@
         </w:tc>
       </w:tr>
       <w:tr>
-        <w:tblPrEx>
-          <w:tblCellMar>
-            <w:top w:w="0" w:type="dxa"/>
-            <w:bottom w:w="0" w:type="dxa"/>
-          </w:tblCellMar>
-        </w:tblPrEx>
         <w:tc>
           <w:tcPr>
             <w:tcW w:w="1560" w:type="dxa"/>
@@ -5031,12 +4833,6 @@
         </w:tc>
       </w:tr>
       <w:tr>
-        <w:tblPrEx>
-          <w:tblCellMar>
-            <w:top w:w="0" w:type="dxa"/>
-            <w:bottom w:w="0" w:type="dxa"/>
-          </w:tblCellMar>
-        </w:tblPrEx>
         <w:tc>
           <w:tcPr>
             <w:tcW w:w="1560" w:type="dxa"/>
@@ -5462,12 +5258,6 @@
         <w:gridCol w:w="2100"/>
       </w:tblGrid>
       <w:tr>
-        <w:tblPrEx>
-          <w:tblCellMar>
-            <w:top w:w="0" w:type="dxa"/>
-            <w:bottom w:w="0" w:type="dxa"/>
-          </w:tblCellMar>
-        </w:tblPrEx>
         <w:trPr>
           <w:tblHeader/>
         </w:trPr>
@@ -5641,12 +5431,6 @@
         </w:tc>
       </w:tr>
       <w:tr>
-        <w:tblPrEx>
-          <w:tblCellMar>
-            <w:top w:w="0" w:type="dxa"/>
-            <w:bottom w:w="0" w:type="dxa"/>
-          </w:tblCellMar>
-        </w:tblPrEx>
         <w:tc>
           <w:tcPr>
             <w:tcW w:w="1700" w:type="dxa"/>
@@ -5791,12 +5575,6 @@
         </w:tc>
       </w:tr>
       <w:tr>
-        <w:tblPrEx>
-          <w:tblCellMar>
-            <w:top w:w="0" w:type="dxa"/>
-            <w:bottom w:w="0" w:type="dxa"/>
-          </w:tblCellMar>
-        </w:tblPrEx>
         <w:tc>
           <w:tcPr>
             <w:tcW w:w="1700" w:type="dxa"/>
@@ -5941,12 +5719,6 @@
         </w:tc>
       </w:tr>
       <w:tr>
-        <w:tblPrEx>
-          <w:tblCellMar>
-            <w:top w:w="0" w:type="dxa"/>
-            <w:bottom w:w="0" w:type="dxa"/>
-          </w:tblCellMar>
-        </w:tblPrEx>
         <w:tc>
           <w:tcPr>
             <w:tcW w:w="1700" w:type="dxa"/>
@@ -6093,12 +5865,6 @@
         </w:tc>
       </w:tr>
       <w:tr>
-        <w:tblPrEx>
-          <w:tblCellMar>
-            <w:top w:w="0" w:type="dxa"/>
-            <w:bottom w:w="0" w:type="dxa"/>
-          </w:tblCellMar>
-        </w:tblPrEx>
         <w:tc>
           <w:tcPr>
             <w:tcW w:w="1700" w:type="dxa"/>
@@ -6535,12 +6301,6 @@
         <w:gridCol w:w="8060"/>
       </w:tblGrid>
       <w:tr>
-        <w:tblPrEx>
-          <w:tblCellMar>
-            <w:top w:w="0" w:type="dxa"/>
-            <w:bottom w:w="0" w:type="dxa"/>
-          </w:tblCellMar>
-        </w:tblPrEx>
         <w:trPr>
           <w:tblHeader/>
         </w:trPr>
@@ -6604,12 +6364,6 @@
         </w:tc>
       </w:tr>
       <w:tr>
-        <w:tblPrEx>
-          <w:tblCellMar>
-            <w:top w:w="0" w:type="dxa"/>
-            <w:bottom w:w="0" w:type="dxa"/>
-          </w:tblCellMar>
-        </w:tblPrEx>
         <w:tc>
           <w:tcPr>
             <w:tcW w:w="1300" w:type="dxa"/>
@@ -6664,12 +6418,6 @@
         </w:tc>
       </w:tr>
       <w:tr>
-        <w:tblPrEx>
-          <w:tblCellMar>
-            <w:top w:w="0" w:type="dxa"/>
-            <w:bottom w:w="0" w:type="dxa"/>
-          </w:tblCellMar>
-        </w:tblPrEx>
         <w:tc>
           <w:tcPr>
             <w:tcW w:w="1300" w:type="dxa"/>
@@ -6756,12 +6504,6 @@
         </w:tc>
       </w:tr>
       <w:tr>
-        <w:tblPrEx>
-          <w:tblCellMar>
-            <w:top w:w="0" w:type="dxa"/>
-            <w:bottom w:w="0" w:type="dxa"/>
-          </w:tblCellMar>
-        </w:tblPrEx>
         <w:tc>
           <w:tcPr>
             <w:tcW w:w="1300" w:type="dxa"/>
@@ -6816,12 +6558,6 @@
         </w:tc>
       </w:tr>
       <w:tr>
-        <w:tblPrEx>
-          <w:tblCellMar>
-            <w:top w:w="0" w:type="dxa"/>
-            <w:bottom w:w="0" w:type="dxa"/>
-          </w:tblCellMar>
-        </w:tblPrEx>
         <w:tc>
           <w:tcPr>
             <w:tcW w:w="1300" w:type="dxa"/>
@@ -6876,12 +6612,6 @@
         </w:tc>
       </w:tr>
       <w:tr>
-        <w:tblPrEx>
-          <w:tblCellMar>
-            <w:top w:w="0" w:type="dxa"/>
-            <w:bottom w:w="0" w:type="dxa"/>
-          </w:tblCellMar>
-        </w:tblPrEx>
         <w:tc>
           <w:tcPr>
             <w:tcW w:w="1300" w:type="dxa"/>
@@ -6936,12 +6666,6 @@
         </w:tc>
       </w:tr>
       <w:tr>
-        <w:tblPrEx>
-          <w:tblCellMar>
-            <w:top w:w="0" w:type="dxa"/>
-            <w:bottom w:w="0" w:type="dxa"/>
-          </w:tblCellMar>
-        </w:tblPrEx>
         <w:tc>
           <w:tcPr>
             <w:tcW w:w="1300" w:type="dxa"/>
@@ -6996,12 +6720,6 @@
         </w:tc>
       </w:tr>
       <w:tr>
-        <w:tblPrEx>
-          <w:tblCellMar>
-            <w:top w:w="0" w:type="dxa"/>
-            <w:bottom w:w="0" w:type="dxa"/>
-          </w:tblCellMar>
-        </w:tblPrEx>
         <w:tc>
           <w:tcPr>
             <w:tcW w:w="1300" w:type="dxa"/>
@@ -7056,12 +6774,6 @@
         </w:tc>
       </w:tr>
       <w:tr>
-        <w:tblPrEx>
-          <w:tblCellMar>
-            <w:top w:w="0" w:type="dxa"/>
-            <w:bottom w:w="0" w:type="dxa"/>
-          </w:tblCellMar>
-        </w:tblPrEx>
         <w:tc>
           <w:tcPr>
             <w:tcW w:w="1300" w:type="dxa"/>
@@ -7364,12 +7076,6 @@
         <w:gridCol w:w="1300"/>
       </w:tblGrid>
       <w:tr>
-        <w:tblPrEx>
-          <w:tblCellMar>
-            <w:top w:w="0" w:type="dxa"/>
-            <w:bottom w:w="0" w:type="dxa"/>
-          </w:tblCellMar>
-        </w:tblPrEx>
         <w:trPr>
           <w:tblHeader/>
         </w:trPr>
@@ -7529,12 +7235,6 @@
         </w:tc>
       </w:tr>
       <w:tr>
-        <w:tblPrEx>
-          <w:tblCellMar>
-            <w:top w:w="0" w:type="dxa"/>
-            <w:bottom w:w="0" w:type="dxa"/>
-          </w:tblCellMar>
-        </w:tblPrEx>
         <w:tc>
           <w:tcPr>
             <w:tcW w:w="2100" w:type="dxa"/>
@@ -7676,12 +7376,6 @@
         </w:tc>
       </w:tr>
       <w:tr>
-        <w:tblPrEx>
-          <w:tblCellMar>
-            <w:top w:w="0" w:type="dxa"/>
-            <w:bottom w:w="0" w:type="dxa"/>
-          </w:tblCellMar>
-        </w:tblPrEx>
         <w:tc>
           <w:tcPr>
             <w:tcW w:w="2100" w:type="dxa"/>
@@ -7825,12 +7519,6 @@
         </w:tc>
       </w:tr>
       <w:tr>
-        <w:tblPrEx>
-          <w:tblCellMar>
-            <w:top w:w="0" w:type="dxa"/>
-            <w:bottom w:w="0" w:type="dxa"/>
-          </w:tblCellMar>
-        </w:tblPrEx>
         <w:tc>
           <w:tcPr>
             <w:tcW w:w="2100" w:type="dxa"/>
@@ -7974,12 +7662,6 @@
         </w:tc>
       </w:tr>
       <w:tr>
-        <w:tblPrEx>
-          <w:tblCellMar>
-            <w:top w:w="0" w:type="dxa"/>
-            <w:bottom w:w="0" w:type="dxa"/>
-          </w:tblCellMar>
-        </w:tblPrEx>
         <w:tc>
           <w:tcPr>
             <w:tcW w:w="2100" w:type="dxa"/>
@@ -8123,12 +7805,6 @@
         </w:tc>
       </w:tr>
       <w:tr>
-        <w:tblPrEx>
-          <w:tblCellMar>
-            <w:top w:w="0" w:type="dxa"/>
-            <w:bottom w:w="0" w:type="dxa"/>
-          </w:tblCellMar>
-        </w:tblPrEx>
         <w:tc>
           <w:tcPr>
             <w:tcW w:w="2100" w:type="dxa"/>
@@ -8270,12 +7946,6 @@
         </w:tc>
       </w:tr>
       <w:tr>
-        <w:tblPrEx>
-          <w:tblCellMar>
-            <w:top w:w="0" w:type="dxa"/>
-            <w:bottom w:w="0" w:type="dxa"/>
-          </w:tblCellMar>
-        </w:tblPrEx>
         <w:tc>
           <w:tcPr>
             <w:tcW w:w="2100" w:type="dxa"/>
@@ -8417,12 +8087,6 @@
         </w:tc>
       </w:tr>
       <w:tr>
-        <w:tblPrEx>
-          <w:tblCellMar>
-            <w:top w:w="0" w:type="dxa"/>
-            <w:bottom w:w="0" w:type="dxa"/>
-          </w:tblCellMar>
-        </w:tblPrEx>
         <w:tc>
           <w:tcPr>
             <w:tcW w:w="2100" w:type="dxa"/>
@@ -8575,12 +8239,6 @@
         </w:tc>
       </w:tr>
       <w:tr>
-        <w:tblPrEx>
-          <w:tblCellMar>
-            <w:top w:w="0" w:type="dxa"/>
-            <w:bottom w:w="0" w:type="dxa"/>
-          </w:tblCellMar>
-        </w:tblPrEx>
         <w:tc>
           <w:tcPr>
             <w:tcW w:w="2100" w:type="dxa"/>
@@ -10163,6 +9821,7 @@
   <w:style w:type="character" w:default="1" w:styleId="DefaultParagraphFont">
     <w:name w:val="Default Paragraph Font"/>
     <w:uiPriority w:val="1"/>
+    <w:semiHidden/>
     <w:unhideWhenUsed/>
   </w:style>
   <w:style w:type="table" w:default="1" w:styleId="TableNormal">

</xml_diff>